<commit_message>
feat: release version 3.9 dashboard and event lifecycle
Dashboard tabs and incremental loading; Bangkok event lifecycle guards; effective Admin status; sample-data and operational documentation.
</commit_message>
<xml_diff>
--- a/deliverables/Virtual-RUN-Installation-and-Sample-Data-Restore-Guide-TH.docx
+++ b/deliverables/Virtual-RUN-Installation-and-Sample-Data-Restore-Guide-TH.docx
@@ -473,10 +473,7 @@
         <w:spacing w:after="60"/>
       </w:pPr>
       <w:r>
-        <w:rPr>
-          <w:rFonts w:ascii="Tahoma" w:hAnsi="Tahoma" w:eastAsia="Tahoma" w:cs="Tahoma"/>
-        </w:rPr>
-        <w:t>ติดตั้ง Supabase Self Hosted</w:t>
+        <w:t xml:space="preserve">ตรวจสอบหรือติดตั้ง Supabase Self Hosted</w:t>
       </w:r>
     </w:p>
     <w:p>
@@ -565,17 +562,7 @@
     </w:p>
     <w:p>
       <w:r>
-        <w:rPr>
-          <w:rFonts w:ascii="Tahoma" w:hAnsi="Tahoma" w:eastAsia="Tahoma" w:cs="Tahoma"/>
-          <w:b/>
-        </w:rPr>
-        <w:t xml:space="preserve">ผังงานโดยย่อ  </w:t>
-      </w:r>
-      <w:r>
-        <w:rPr>
-          <w:rFonts w:ascii="Tahoma" w:hAnsi="Tahoma" w:eastAsia="Tahoma" w:cs="Tahoma"/>
-        </w:rPr>
-        <w:t>เตรียมเครื่องและไฟล์สำรอง  ติดตั้ง Supabase  คืนฐานข้อมูล  คืน Storage  ตั้งค่าแอป  เปิด Docker  ตรวจสอบระบบ</w:t>
+        <w:t xml:space="preserve">ผังงานโดยย่อ  เตรียมเครื่องและไฟล์สำรอง  ตรวจสอบหรือติดตั้ง Supabase  คืนฐานข้อมูล  คืน Storage  ตั้งค่าแอป  เปิด Docker  ตรวจสอบระบบ</w:t>
       </w:r>
     </w:p>
     <w:p>
@@ -1741,21 +1728,60 @@
         <w:pStyle w:val="Heading1"/>
       </w:pPr>
       <w:r>
-        <w:rPr>
-          <w:rFonts w:ascii="Tahoma" w:hAnsi="Tahoma" w:eastAsia="Tahoma" w:cs="Tahoma"/>
-          <w:b/>
-          <w:color w:val="000000"/>
-          <w:sz w:val="34"/>
-        </w:rPr>
-        <w:t>3 ติดตั้ง Supabase Self Hosted</w:t>
+        <w:t xml:space="preserve">3 ตรวจสอบหรือติดตั้ง Supabase Self Hosted</w:t>
       </w:r>
     </w:p>
     <w:p>
       <w:r>
-        <w:rPr>
-          <w:rFonts w:ascii="Tahoma" w:hAnsi="Tahoma" w:eastAsia="Tahoma" w:cs="Tahoma"/>
-        </w:rPr>
-        <w:t>วิธีที่สั้นที่สุดบน Ubuntu คือใช้ setup script ทางการของ Supabase สคริปต์จะติดตั้งส่วนที่จำเป็น สร้าง secrets และเตรียม Docker Compose ให้โดยอัตโนมัติ ควรเปิดอ่านสคริปต์ก่อนใช้ในสภาพแวดล้อมที่มีข้อกำหนดด้านความปลอดภัย</w:t>
+        <w:t xml:space="preserve">เลือกทำเพียงกรณีเดียวตามสถานะของเครื่องปลายทาง หากระบบเชื่อมต่อ Supabase ได้อยู่แล้ว ไม่ต้องติดตั้งซ้ำและไม่ต้องสร้าง secrets ใหม่</w:t>
+      </w:r>
+    </w:p>
+    <w:p>
+      <w:pPr>
+        <w:pStyle w:val="Heading2"/>
+      </w:pPr>
+      <w:r>
+        <w:t xml:space="preserve">กรณี A ระบบเดิมใช้งานได้แล้ว</w:t>
+      </w:r>
+    </w:p>
+    <w:p>
+      <w:r>
+        <w:t xml:space="preserve">หากหน้าเว็บใช้งานได้และแอปเชื่อม Database, Auth, REST และ Storage ชุดเดิมได้ ให้ข้าม setup script และคำสั่ง run.sh start ทั้งหมด ใช้ตำแหน่งติดตั้ง Supabase เดิมของเครื่อง แล้วตรวจเฉพาะสถานะบริการ</w:t>
+      </w:r>
+    </w:p>
+    <w:p>
+      <w:pPr>
+        <w:pStyle w:val="CodeBlock"/>
+      </w:pPr>
+      <w:r>
+        <w:t xml:space="preserve">cd /ตำแหน่งจริงของ/supabase-project</w:t>
+        <w:br/>
+      </w:r>
+      <w:r>
+        <w:t xml:space="preserve">docker compose ps</w:t>
+      </w:r>
+    </w:p>
+    <w:p>
+      <w:r>
+        <w:t xml:space="preserve">ผลที่ต้องได้  Database, Auth, REST, Storage และ API gateway อยู่ในสถานะ running หรือ healthy หากบริการใดไม่พร้อม ให้แก้บริการเดิมก่อน restore ไม่ควรสร้าง Supabase ชุดที่สอง</w:t>
+      </w:r>
+    </w:p>
+    <w:p>
+      <w:r>
+        <w:t xml:space="preserve">ไม่ต้องรัน sh run.sh secrets หากไฟล์ .env ของแอปมี keys ถูกต้องและแอปเชื่อมต่อได้แล้ว คำสั่งนี้ใช้ดู keys เท่านั้นและอาจแสดงข้อมูลลับบนหน้าจอ</w:t>
+      </w:r>
+    </w:p>
+    <w:p>
+      <w:pPr>
+        <w:pStyle w:val="Heading2"/>
+      </w:pPr>
+      <w:r>
+        <w:t xml:space="preserve">กรณี B เครื่องใหม่ที่ยังไม่มี Supabase</w:t>
+      </w:r>
+    </w:p>
+    <w:p>
+      <w:r>
+        <w:t xml:space="preserve">สำหรับเครื่องใหม่ที่ยังไม่มี Supabase Self Hosted วิธีที่สั้นที่สุดบน Ubuntu คือใช้ setup script ทางการของ Supabase สคริปต์จะติดตั้งส่วนที่จำเป็น สร้าง secrets และเตรียม Docker Compose ให้โดยอัตโนมัติ ควรเปิดอ่านสคริปต์ก่อนใช้ในสภาพแวดล้อมที่มีข้อกำหนดด้านความปลอดภัย</w:t>
       </w:r>
     </w:p>
     <w:p>
@@ -1884,39 +1910,27 @@
     </w:p>
     <w:p>
       <w:r>
-        <w:rPr>
-          <w:rFonts w:ascii="Tahoma" w:hAnsi="Tahoma" w:eastAsia="Tahoma" w:cs="Tahoma"/>
-        </w:rPr>
-        <w:t>ตรวจบริการและบันทึก keys โดยไม่ส่งค่าผ่านแชตหรือ commit ลง Git</w:t>
+        <w:t xml:space="preserve">หลังติดตั้งเครื่องใหม่ ให้ตรวจบริการก่อน ส่วนคำสั่งดู keys ใช้เฉพาะเมื่อต้องนำค่าไปตั้งในแอป และห้ามส่งค่าผ่านแชตหรือ commit ลง Git</w:t>
       </w:r>
     </w:p>
     <w:p>
       <w:pPr>
         <w:pStyle w:val="CodeBlock"/>
-        <w:shd w:fill="F3F4F6"/>
       </w:pPr>
       <w:r>
-        <w:rPr>
-          <w:rFonts w:ascii="Consolas" w:hAnsi="Consolas" w:eastAsia="Consolas" w:cs="Consolas"/>
-          <w:sz w:val="17"/>
-        </w:rPr>
-        <w:t>cd /opt/virtual-run-stack/supabase-project</w:t>
+        <w:t xml:space="preserve">cd /opt/virtual-run-stack/supabase-project</w:t>
         <w:br/>
       </w:r>
       <w:r>
-        <w:rPr>
-          <w:rFonts w:ascii="Consolas" w:hAnsi="Consolas" w:eastAsia="Consolas" w:cs="Consolas"/>
-          <w:sz w:val="17"/>
-        </w:rPr>
-        <w:t>docker compose ps</w:t>
+        <w:t xml:space="preserve">docker compose ps</w:t>
         <w:br/>
       </w:r>
       <w:r>
-        <w:rPr>
-          <w:rFonts w:ascii="Consolas" w:hAnsi="Consolas" w:eastAsia="Consolas" w:cs="Consolas"/>
-          <w:sz w:val="17"/>
-        </w:rPr>
-        <w:t>sh run.sh secrets</w:t>
+        <w:t xml:space="preserve"># รันบรรทัดถัดไปเฉพาะเมื่อต้องดึง keys ไปตั้งในแอป</w:t>
+        <w:br/>
+      </w:r>
+      <w:r>
+        <w:t xml:space="preserve">sh run.sh secrets</w:t>
       </w:r>
     </w:p>
     <w:p>
@@ -1950,10 +1964,7 @@
     </w:p>
     <w:p>
       <w:r>
-        <w:rPr>
-          <w:rFonts w:ascii="Tahoma" w:hAnsi="Tahoma" w:eastAsia="Tahoma" w:cs="Tahoma"/>
-        </w:rPr>
-        <w:t>ทำขั้นตอนนี้กับ Supabase ใหม่ที่ยังไม่มีข้อมูล Virtual RUN เท่านั้น การนำเข้าบนฐานข้อมูลที่ใช้งานอยู่แล้วอาจเกิดข้อมูลซ้ำหรือชนกับ primary key</w:t>
+        <w:t xml:space="preserve">ชุดคำสั่งด้านล่างเป็นการคืนข้อมูลแบบเต็ม ใช้เมื่อฐานข้อมูลปลายทางยังไม่มี schema และข้อมูล Virtual RUN หรือผ่านการ reset เพื่อรับชุดสำรองนี้แล้วเท่านั้น หากระบบเดิมติดตั้ง migrations หรือมีค่าเริ่มต้นอยู่แล้ว แม้ยังไม่มี sample data ห้ามรัน roles.sql, schema.sql และ data.sql ต่อทันที เพราะอาจชนกับตาราง policy primary key หรือ Storage metadata เดิม ให้สำรองฐานข้อมูลและ Storage ปัจจุบันก่อน แล้วเลือก reset ฐานข้อมูลแบบควบคุมหรือจัดทำ selective import แยกต่างหาก</w:t>
       </w:r>
     </w:p>
     <w:p>

</xml_diff>